<commit_message>
build(HR-01, HR-03): rebuild DOCX; drop the four stale peer-slug outputs
Co-Authored-By: Claude Fable 5 <noreply@anthropic.com>
Claude-Session: f666cd6a-e0fc-4a0f-8e0b-b2cd1a53df02
</commit_message>
<xml_diff>
--- a/artifacts/HR-01/build/intake-brief-rqn-2026-0106.docx
+++ b/artifacts/HR-01/build/intake-brief-rqn-2026-0106.docx
@@ -2,13 +2,13 @@
 <file path=word/document.xml><?xml version="1.0" encoding="utf-8"?>
 <w:document xmlns:w="http://schemas.openxmlformats.org/wordprocessingml/2006/main" xmlns:m="http://schemas.openxmlformats.org/officeDocument/2006/math" xmlns:r="http://schemas.openxmlformats.org/officeDocument/2006/relationships" xmlns:o="urn:schemas-microsoft-com:office:office" xmlns:v="urn:schemas-microsoft-com:vml" xmlns:w10="urn:schemas-microsoft-com:office:word" xmlns:a="http://schemas.openxmlformats.org/drawingml/2006/main" xmlns:pic="http://schemas.openxmlformats.org/drawingml/2006/picture" xmlns:wp="http://schemas.openxmlformats.org/drawingml/2006/wordprocessingDrawing">
   <w:body>
-    <w:bookmarkStart w:id="14" w:name="intake-brief-operations-analyst"/>
+    <w:bookmarkStart w:id="14" w:name="intake-brief-program-manager"/>
     <w:p>
       <w:pPr>
         <w:pStyle w:val="Heading1"/>
       </w:pPr>
       <w:r>
-        <w:t xml:space="preserve">Intake brief: Operations Analyst</w:t>
+        <w:t xml:space="preserve">Intake brief: Program Manager</w:t>
       </w:r>
     </w:p>
     <w:p>
@@ -32,7 +32,7 @@
         </w:numPr>
       </w:pPr>
       <w:r>
-        <w:t xml:space="preserve">Requisition title: Operations Analyst</w:t>
+        <w:t xml:space="preserve">Requisition title: Program Manager</w:t>
       </w:r>
     </w:p>
     <w:p>
@@ -145,7 +145,7 @@
         <w:pStyle w:val="FirstParagraph"/>
       </w:pPr>
       <w:r>
-        <w:t xml:space="preserve">Intake into this group arrives through four channels that were each sensible on their own day and have never been reconciled, so the same request is sometimes worked twice and sometimes not at all. This role owns the intake picture: one queue, one set of definitions for what counts as a request, and a weekly read that the group can act on. It is deliberately an analyst seat rather than a coordinator seat, because the fix is in the definitions before it is in the routing.</w:t>
+        <w:t xml:space="preserve">The customer onboarding revamp runs in several regions at once and is held together by the people closest to it rather than by a plan anyone else can read. The readiness checklist exists in more than one version and the regions disagree about which is current, call notes and the tickets that follow them do not point at each other, and the weekly status goes out before the tracker behind it is refreshed. This seat owns the plan around all of that: the sequence, what each region waits on and from whom, the record of what was decided, and a status a sponsor can act on. It is a senior individual contributor seat with no reports, so the work is carried by writing and by influence.</w:t>
       </w:r>
     </w:p>
     <w:bookmarkEnd w:id="9"/>
@@ -163,7 +163,7 @@
         <w:pStyle w:val="FirstParagraph"/>
       </w:pPr>
       <w:r>
-        <w:t xml:space="preserve">The person we hire will be comfortable saying that a process is wrong in front of the people who built it, and will do it with evidence rather than with an opinion. Most of the first quarter is reconstruction: reading what the four channels actually carry, separating the requests that differ in substance from the ones that differ only in wording, and writing that down so the group can argue with a document instead of with each other. We want somebody who has done a reconciliation like that before, at any scale, and who can describe what they threw away as well as what they kept. Spreadsheet fluency is assumed. A candidate who reaches for a new tool in the first month is answering a different question than the one being asked. Because the output is read by three teams who do not share vocabulary, plain writing carries more weight in this loop than technical range does.</w:t>
+        <w:t xml:space="preserve">We are hiring for the judgment that keeps a rollout across regions honest, rather than for a method. The person we want has run a program whose parts were owned by people who did not report to them, and can describe how they held a date without pretending the risk had gone away. Much of the first quarter is reconstruction: one definition of ready instead of several, a list that names what each region waits on and from whom, and a status that matches the tracker it is drawn from. We will ask about a plan that slipped, because every plan does, and we are listening for whether the candidate saw it coming and said so early or explained it afterward. The status note, the decision record and the escalation path are what this seat carries rather than overhead around it, so somebody who has only run a program out loud will find the first month uncomfortable. We are open on sector. We are firm that a missed dependency has landed on somebody this person then had to face.</w:t>
       </w:r>
     </w:p>
     <w:bookmarkEnd w:id="10"/>
@@ -181,7 +181,7 @@
         <w:pStyle w:val="FirstParagraph"/>
       </w:pPr>
       <w:r>
-        <w:t xml:space="preserve">Familiarity with a service management queue, or with running a recurring operational review that other people rely on, would both shorten the ramp considerably. Somebody who has worked next to a finance or a people function will already have met the reporting rhythm this group is trying to build toward.</w:t>
+        <w:t xml:space="preserve">Experience taking a program off a set of documents that disagreed with each other, or of moving a legacy record set across while the live work continued, would both land well. Somebody who has run a recurring status other teams rely on will already know why the tracker and the note have to tell one story.</w:t>
       </w:r>
     </w:p>
     <w:bookmarkEnd w:id="11"/>
@@ -215,7 +215,7 @@
         </w:numPr>
       </w:pPr>
       <w:r>
-        <w:t xml:space="preserve">Data literacy (CMP-08)</w:t>
+        <w:t xml:space="preserve">Collaboration across teams (CMP-05)</w:t>
       </w:r>
     </w:p>
     <w:p>
@@ -227,7 +227,7 @@
         </w:numPr>
       </w:pPr>
       <w:r>
-        <w:t xml:space="preserve">Prioritization under constraint (CMP-10)</w:t>
+        <w:t xml:space="preserve">Customer empathy (CMP-06)</w:t>
       </w:r>
     </w:p>
     <w:p>
@@ -239,6 +239,18 @@
         </w:numPr>
       </w:pPr>
       <w:r>
+        <w:t xml:space="preserve">Prioritization under constraint (CMP-10)</w:t>
+      </w:r>
+    </w:p>
+    <w:p>
+      <w:pPr>
+        <w:pStyle w:val="Compact"/>
+        <w:numPr>
+          <w:ilvl w:val="0"/>
+          <w:numId w:val="1002"/>
+        </w:numPr>
+      </w:pPr>
+      <w:r>
         <w:t xml:space="preserve">Operational rigor (CMP-12)</w:t>
       </w:r>
     </w:p>
@@ -257,7 +269,7 @@
         <w:pStyle w:val="FirstParagraph"/>
       </w:pPr>
       <w:r>
-        <w:t xml:space="preserve">Three conversations, with a short written exercise sent before the second one so the panel has something concrete to discuss.</w:t>
+        <w:t xml:space="preserve">Three conversations, run inside a two week window, with a written debrief from each panel member before any decision is discussed.</w:t>
       </w:r>
     </w:p>
     <w:p>
@@ -281,7 +293,7 @@
         </w:numPr>
       </w:pPr>
       <w:r>
-        <w:t xml:space="preserve">Operations Manager, the reconciliation conversation and the written exercise</w:t>
+        <w:t xml:space="preserve">Operations Manager, the program itself, its sequence and its escalation path</w:t>
       </w:r>
     </w:p>
     <w:p>
@@ -293,7 +305,7 @@
         </w:numPr>
       </w:pPr>
       <w:r>
-        <w:t xml:space="preserve">Director, Operations, a closing conversation on influence without authority</w:t>
+        <w:t xml:space="preserve">Program Manager, a working session on a plan and the dependencies under it</w:t>
       </w:r>
     </w:p>
     <w:bookmarkEnd w:id="13"/>

</xml_diff>